<commit_message>
Ampliar documento Word con requisitos extra y RNF
Agent-Logs-Url: https://github.com/acmazoh/Gestion_pedidos_inventario/sessions/8b6ee90f-15e7-455d-a41e-953768b6f280

Co-authored-by: jjpalacioz <158492102+jjpalacioz@users.noreply.github.com>
</commit_message>
<xml_diff>
--- a/Requerimientos_Proyecto_Gestion_Pedidos_Inventario.docx
+++ b/Requerimientos_Proyecto_Gestion_Pedidos_Inventario.docx
@@ -6,8 +6,7 @@
       <w:r>
         <w:rPr>
           <w:b/>
-          <w:i/>
-          <w:sz w:val="40"/>
+          <w:sz w:val="32"/>
         </w:rPr>
         <w:t>1. Project requirements</w:t>
       </w:r>
@@ -15,10 +14,9 @@
     <w:p>
       <w:r>
         <w:rPr>
-          <w:i/>
           <w:sz w:val="22"/>
         </w:rPr>
-        <w:t>[Listado de requerimientos funcionales del proyecto, indicando cuáles están desarrollados y cuáles no. Si se definieron nuevos requerimientos durante el desarrollo del proyecto, también se agregan en esta tabla. El requerimiento se escribe en el formato correcto y, si fue desarrollado, se indica el sprint en el que se implementó.]</w:t>
+        <w:t>Listado de requerimientos funcionales del proyecto, indicando cuáles están desarrollados y en qué sprint se implementaron.</w:t>
       </w:r>
     </w:p>
     <w:tbl>
@@ -109,9 +107,6 @@
             <w:tcW w:type="dxa" w:w="2160"/>
           </w:tcPr>
           <w:p>
-            <w:pPr>
-              <w:jc w:val="center"/>
-            </w:pPr>
             <w:r>
               <w:rPr>
                 <w:sz w:val="22"/>
@@ -172,9 +167,6 @@
             <w:tcW w:type="dxa" w:w="2160"/>
           </w:tcPr>
           <w:p>
-            <w:pPr>
-              <w:jc w:val="center"/>
-            </w:pPr>
             <w:r>
               <w:rPr>
                 <w:sz w:val="22"/>
@@ -235,9 +227,6 @@
             <w:tcW w:type="dxa" w:w="2160"/>
           </w:tcPr>
           <w:p>
-            <w:pPr>
-              <w:jc w:val="center"/>
-            </w:pPr>
             <w:r>
               <w:rPr>
                 <w:sz w:val="22"/>
@@ -298,9 +287,6 @@
             <w:tcW w:type="dxa" w:w="2160"/>
           </w:tcPr>
           <w:p>
-            <w:pPr>
-              <w:jc w:val="center"/>
-            </w:pPr>
             <w:r>
               <w:rPr>
                 <w:sz w:val="22"/>
@@ -361,9 +347,6 @@
             <w:tcW w:type="dxa" w:w="2160"/>
           </w:tcPr>
           <w:p>
-            <w:pPr>
-              <w:jc w:val="center"/>
-            </w:pPr>
             <w:r>
               <w:rPr>
                 <w:sz w:val="22"/>
@@ -424,9 +407,6 @@
             <w:tcW w:type="dxa" w:w="2160"/>
           </w:tcPr>
           <w:p>
-            <w:pPr>
-              <w:jc w:val="center"/>
-            </w:pPr>
             <w:r>
               <w:rPr>
                 <w:sz w:val="22"/>
@@ -487,9 +467,6 @@
             <w:tcW w:type="dxa" w:w="2160"/>
           </w:tcPr>
           <w:p>
-            <w:pPr>
-              <w:jc w:val="center"/>
-            </w:pPr>
             <w:r>
               <w:rPr>
                 <w:sz w:val="22"/>
@@ -550,9 +527,6 @@
             <w:tcW w:type="dxa" w:w="2160"/>
           </w:tcPr>
           <w:p>
-            <w:pPr>
-              <w:jc w:val="center"/>
-            </w:pPr>
             <w:r>
               <w:rPr>
                 <w:sz w:val="22"/>
@@ -613,9 +587,6 @@
             <w:tcW w:type="dxa" w:w="2160"/>
           </w:tcPr>
           <w:p>
-            <w:pPr>
-              <w:jc w:val="center"/>
-            </w:pPr>
             <w:r>
               <w:rPr>
                 <w:sz w:val="22"/>
@@ -676,9 +647,6 @@
             <w:tcW w:type="dxa" w:w="2160"/>
           </w:tcPr>
           <w:p>
-            <w:pPr>
-              <w:jc w:val="center"/>
-            </w:pPr>
             <w:r>
               <w:rPr>
                 <w:sz w:val="22"/>
@@ -739,9 +707,6 @@
             <w:tcW w:type="dxa" w:w="2160"/>
           </w:tcPr>
           <w:p>
-            <w:pPr>
-              <w:jc w:val="center"/>
-            </w:pPr>
             <w:r>
               <w:rPr>
                 <w:sz w:val="22"/>
@@ -802,9 +767,6 @@
             <w:tcW w:type="dxa" w:w="2160"/>
           </w:tcPr>
           <w:p>
-            <w:pPr>
-              <w:jc w:val="center"/>
-            </w:pPr>
             <w:r>
               <w:rPr>
                 <w:sz w:val="22"/>
@@ -865,9 +827,6 @@
             <w:tcW w:type="dxa" w:w="2160"/>
           </w:tcPr>
           <w:p>
-            <w:pPr>
-              <w:jc w:val="center"/>
-            </w:pPr>
             <w:r>
               <w:rPr>
                 <w:sz w:val="22"/>
@@ -928,9 +887,6 @@
             <w:tcW w:type="dxa" w:w="2160"/>
           </w:tcPr>
           <w:p>
-            <w:pPr>
-              <w:jc w:val="center"/>
-            </w:pPr>
             <w:r>
               <w:rPr>
                 <w:sz w:val="22"/>
@@ -991,9 +947,6 @@
             <w:tcW w:type="dxa" w:w="2160"/>
           </w:tcPr>
           <w:p>
-            <w:pPr>
-              <w:jc w:val="center"/>
-            </w:pPr>
             <w:r>
               <w:rPr>
                 <w:sz w:val="22"/>
@@ -1054,9 +1007,6 @@
             <w:tcW w:type="dxa" w:w="2160"/>
           </w:tcPr>
           <w:p>
-            <w:pPr>
-              <w:jc w:val="center"/>
-            </w:pPr>
             <w:r>
               <w:rPr>
                 <w:sz w:val="22"/>
@@ -1117,9 +1067,6 @@
             <w:tcW w:type="dxa" w:w="2160"/>
           </w:tcPr>
           <w:p>
-            <w:pPr>
-              <w:jc w:val="center"/>
-            </w:pPr>
             <w:r>
               <w:rPr>
                 <w:sz w:val="22"/>
@@ -1180,9 +1127,6 @@
             <w:tcW w:type="dxa" w:w="2160"/>
           </w:tcPr>
           <w:p>
-            <w:pPr>
-              <w:jc w:val="center"/>
-            </w:pPr>
             <w:r>
               <w:rPr>
                 <w:sz w:val="22"/>
@@ -1243,9 +1187,6 @@
             <w:tcW w:type="dxa" w:w="2160"/>
           </w:tcPr>
           <w:p>
-            <w:pPr>
-              <w:jc w:val="center"/>
-            </w:pPr>
             <w:r>
               <w:rPr>
                 <w:sz w:val="22"/>
@@ -1306,9 +1247,6 @@
             <w:tcW w:type="dxa" w:w="2160"/>
           </w:tcPr>
           <w:p>
-            <w:pPr>
-              <w:jc w:val="center"/>
-            </w:pPr>
             <w:r>
               <w:rPr>
                 <w:sz w:val="22"/>
@@ -1359,6 +1297,606 @@
                 <w:sz w:val="22"/>
               </w:rPr>
               <w:t>4</w:t>
+            </w:r>
+          </w:p>
+        </w:tc>
+      </w:tr>
+      <w:tr>
+        <w:tc>
+          <w:tcPr>
+            <w:tcW w:type="dxa" w:w="2160"/>
+          </w:tcPr>
+          <w:p>
+            <w:r>
+              <w:rPr>
+                <w:sz w:val="22"/>
+              </w:rPr>
+              <w:t>RF-21 (extra)</w:t>
+            </w:r>
+          </w:p>
+        </w:tc>
+        <w:tc>
+          <w:tcPr>
+            <w:tcW w:type="dxa" w:w="2160"/>
+          </w:tcPr>
+          <w:p>
+            <w:r>
+              <w:rPr>
+                <w:sz w:val="22"/>
+              </w:rPr>
+              <w:t>Exportar historial de ventas en CSV</w:t>
+            </w:r>
+          </w:p>
+        </w:tc>
+        <w:tc>
+          <w:tcPr>
+            <w:tcW w:type="dxa" w:w="2160"/>
+          </w:tcPr>
+          <w:p>
+            <w:pPr>
+              <w:jc w:val="center"/>
+            </w:pPr>
+            <w:r>
+              <w:rPr>
+                <w:sz w:val="22"/>
+              </w:rPr>
+              <w:t>Yes</w:t>
+            </w:r>
+          </w:p>
+        </w:tc>
+        <w:tc>
+          <w:tcPr>
+            <w:tcW w:type="dxa" w:w="2160"/>
+          </w:tcPr>
+          <w:p>
+            <w:pPr>
+              <w:jc w:val="center"/>
+            </w:pPr>
+            <w:r>
+              <w:rPr>
+                <w:sz w:val="22"/>
+              </w:rPr>
+              <w:t>3</w:t>
+            </w:r>
+          </w:p>
+        </w:tc>
+      </w:tr>
+      <w:tr>
+        <w:tc>
+          <w:tcPr>
+            <w:tcW w:type="dxa" w:w="2160"/>
+          </w:tcPr>
+          <w:p>
+            <w:r>
+              <w:rPr>
+                <w:sz w:val="22"/>
+              </w:rPr>
+              <w:t>RF-22 (extra)</w:t>
+            </w:r>
+          </w:p>
+        </w:tc>
+        <w:tc>
+          <w:tcPr>
+            <w:tcW w:type="dxa" w:w="2160"/>
+          </w:tcPr>
+          <w:p>
+            <w:r>
+              <w:rPr>
+                <w:sz w:val="22"/>
+              </w:rPr>
+              <w:t>Registrar ventas por endpoint API (sales/register)</w:t>
+            </w:r>
+          </w:p>
+        </w:tc>
+        <w:tc>
+          <w:tcPr>
+            <w:tcW w:type="dxa" w:w="2160"/>
+          </w:tcPr>
+          <w:p>
+            <w:pPr>
+              <w:jc w:val="center"/>
+            </w:pPr>
+            <w:r>
+              <w:rPr>
+                <w:sz w:val="22"/>
+              </w:rPr>
+              <w:t>Yes</w:t>
+            </w:r>
+          </w:p>
+        </w:tc>
+        <w:tc>
+          <w:tcPr>
+            <w:tcW w:type="dxa" w:w="2160"/>
+          </w:tcPr>
+          <w:p>
+            <w:pPr>
+              <w:jc w:val="center"/>
+            </w:pPr>
+            <w:r>
+              <w:rPr>
+                <w:sz w:val="22"/>
+              </w:rPr>
+              <w:t>3</w:t>
+            </w:r>
+          </w:p>
+        </w:tc>
+      </w:tr>
+      <w:tr>
+        <w:tc>
+          <w:tcPr>
+            <w:tcW w:type="dxa" w:w="2160"/>
+          </w:tcPr>
+          <w:p>
+            <w:r>
+              <w:rPr>
+                <w:sz w:val="22"/>
+              </w:rPr>
+              <w:t>RF-23 (extra)</w:t>
+            </w:r>
+          </w:p>
+        </w:tc>
+        <w:tc>
+          <w:tcPr>
+            <w:tcW w:type="dxa" w:w="2160"/>
+          </w:tcPr>
+          <w:p>
+            <w:r>
+              <w:rPr>
+                <w:sz w:val="22"/>
+              </w:rPr>
+              <w:t>Consultar usuario autenticado y rol actual (api/me)</w:t>
+            </w:r>
+          </w:p>
+        </w:tc>
+        <w:tc>
+          <w:tcPr>
+            <w:tcW w:type="dxa" w:w="2160"/>
+          </w:tcPr>
+          <w:p>
+            <w:pPr>
+              <w:jc w:val="center"/>
+            </w:pPr>
+            <w:r>
+              <w:rPr>
+                <w:sz w:val="22"/>
+              </w:rPr>
+              <w:t>Yes</w:t>
+            </w:r>
+          </w:p>
+        </w:tc>
+        <w:tc>
+          <w:tcPr>
+            <w:tcW w:type="dxa" w:w="2160"/>
+          </w:tcPr>
+          <w:p>
+            <w:pPr>
+              <w:jc w:val="center"/>
+            </w:pPr>
+            <w:r>
+              <w:rPr>
+                <w:sz w:val="22"/>
+              </w:rPr>
+              <w:t>3</w:t>
+            </w:r>
+          </w:p>
+        </w:tc>
+      </w:tr>
+      <w:tr>
+        <w:tc>
+          <w:tcPr>
+            <w:tcW w:type="dxa" w:w="2160"/>
+          </w:tcPr>
+          <w:p>
+            <w:r>
+              <w:rPr>
+                <w:sz w:val="22"/>
+              </w:rPr>
+              <w:t>RF-24 (extra)</w:t>
+            </w:r>
+          </w:p>
+        </w:tc>
+        <w:tc>
+          <w:tcPr>
+            <w:tcW w:type="dxa" w:w="2160"/>
+          </w:tcPr>
+          <w:p>
+            <w:r>
+              <w:rPr>
+                <w:sz w:val="22"/>
+              </w:rPr>
+              <w:t>Menú público accesible sin login</w:t>
+            </w:r>
+          </w:p>
+        </w:tc>
+        <w:tc>
+          <w:tcPr>
+            <w:tcW w:type="dxa" w:w="2160"/>
+          </w:tcPr>
+          <w:p>
+            <w:pPr>
+              <w:jc w:val="center"/>
+            </w:pPr>
+            <w:r>
+              <w:rPr>
+                <w:sz w:val="22"/>
+              </w:rPr>
+              <w:t>Yes</w:t>
+            </w:r>
+          </w:p>
+        </w:tc>
+        <w:tc>
+          <w:tcPr>
+            <w:tcW w:type="dxa" w:w="2160"/>
+          </w:tcPr>
+          <w:p>
+            <w:pPr>
+              <w:jc w:val="center"/>
+            </w:pPr>
+            <w:r>
+              <w:rPr>
+                <w:sz w:val="22"/>
+              </w:rPr>
+              <w:t>2</w:t>
+            </w:r>
+          </w:p>
+        </w:tc>
+      </w:tr>
+      <w:tr>
+        <w:tc>
+          <w:tcPr>
+            <w:tcW w:type="dxa" w:w="2160"/>
+          </w:tcPr>
+          <w:p>
+            <w:r>
+              <w:rPr>
+                <w:sz w:val="22"/>
+              </w:rPr>
+              <w:t>RNF-01</w:t>
+            </w:r>
+          </w:p>
+        </w:tc>
+        <w:tc>
+          <w:tcPr>
+            <w:tcW w:type="dxa" w:w="2160"/>
+          </w:tcPr>
+          <w:p>
+            <w:r>
+              <w:rPr>
+                <w:sz w:val="22"/>
+              </w:rPr>
+              <w:t>Rendimiento objetivo &lt; 2 segundos en vistas clave</w:t>
+            </w:r>
+          </w:p>
+        </w:tc>
+        <w:tc>
+          <w:tcPr>
+            <w:tcW w:type="dxa" w:w="2160"/>
+          </w:tcPr>
+          <w:p>
+            <w:pPr>
+              <w:jc w:val="center"/>
+            </w:pPr>
+            <w:r>
+              <w:rPr>
+                <w:sz w:val="22"/>
+              </w:rPr>
+              <w:t>Parcial (embebido en RF)</w:t>
+            </w:r>
+          </w:p>
+        </w:tc>
+        <w:tc>
+          <w:tcPr>
+            <w:tcW w:type="dxa" w:w="2160"/>
+          </w:tcPr>
+          <w:p>
+            <w:pPr>
+              <w:jc w:val="center"/>
+            </w:pPr>
+            <w:r>
+              <w:rPr>
+                <w:sz w:val="22"/>
+              </w:rPr>
+              <w:t>1-2</w:t>
+            </w:r>
+          </w:p>
+        </w:tc>
+      </w:tr>
+      <w:tr>
+        <w:tc>
+          <w:tcPr>
+            <w:tcW w:type="dxa" w:w="2160"/>
+          </w:tcPr>
+          <w:p>
+            <w:r>
+              <w:rPr>
+                <w:sz w:val="22"/>
+              </w:rPr>
+              <w:t>RNF-02</w:t>
+            </w:r>
+          </w:p>
+        </w:tc>
+        <w:tc>
+          <w:tcPr>
+            <w:tcW w:type="dxa" w:w="2160"/>
+          </w:tcPr>
+          <w:p>
+            <w:r>
+              <w:rPr>
+                <w:sz w:val="22"/>
+              </w:rPr>
+              <w:t>Disponibilidad del tablero de cocina en tiempo real</w:t>
+            </w:r>
+          </w:p>
+        </w:tc>
+        <w:tc>
+          <w:tcPr>
+            <w:tcW w:type="dxa" w:w="2160"/>
+          </w:tcPr>
+          <w:p>
+            <w:pPr>
+              <w:jc w:val="center"/>
+            </w:pPr>
+            <w:r>
+              <w:rPr>
+                <w:sz w:val="22"/>
+              </w:rPr>
+              <w:t>Yes (embebido en RF-08)</w:t>
+            </w:r>
+          </w:p>
+        </w:tc>
+        <w:tc>
+          <w:tcPr>
+            <w:tcW w:type="dxa" w:w="2160"/>
+          </w:tcPr>
+          <w:p>
+            <w:pPr>
+              <w:jc w:val="center"/>
+            </w:pPr>
+            <w:r>
+              <w:rPr>
+                <w:sz w:val="22"/>
+              </w:rPr>
+              <w:t>2</w:t>
+            </w:r>
+          </w:p>
+        </w:tc>
+      </w:tr>
+      <w:tr>
+        <w:tc>
+          <w:tcPr>
+            <w:tcW w:type="dxa" w:w="2160"/>
+          </w:tcPr>
+          <w:p>
+            <w:r>
+              <w:rPr>
+                <w:sz w:val="22"/>
+              </w:rPr>
+              <w:t>RNF-03</w:t>
+            </w:r>
+          </w:p>
+        </w:tc>
+        <w:tc>
+          <w:tcPr>
+            <w:tcW w:type="dxa" w:w="2160"/>
+          </w:tcPr>
+          <w:p>
+            <w:r>
+              <w:rPr>
+                <w:sz w:val="22"/>
+              </w:rPr>
+              <w:t>Usabilidad de interfaces de pedidos y cocina</w:t>
+            </w:r>
+          </w:p>
+        </w:tc>
+        <w:tc>
+          <w:tcPr>
+            <w:tcW w:type="dxa" w:w="2160"/>
+          </w:tcPr>
+          <w:p>
+            <w:pPr>
+              <w:jc w:val="center"/>
+            </w:pPr>
+            <w:r>
+              <w:rPr>
+                <w:sz w:val="22"/>
+              </w:rPr>
+              <w:t>Parcial (embebido en RF)</w:t>
+            </w:r>
+          </w:p>
+        </w:tc>
+        <w:tc>
+          <w:tcPr>
+            <w:tcW w:type="dxa" w:w="2160"/>
+          </w:tcPr>
+          <w:p>
+            <w:pPr>
+              <w:jc w:val="center"/>
+            </w:pPr>
+            <w:r>
+              <w:rPr>
+                <w:sz w:val="22"/>
+              </w:rPr>
+              <w:t>1-3</w:t>
+            </w:r>
+          </w:p>
+        </w:tc>
+      </w:tr>
+      <w:tr>
+        <w:tc>
+          <w:tcPr>
+            <w:tcW w:type="dxa" w:w="2160"/>
+          </w:tcPr>
+          <w:p>
+            <w:r>
+              <w:rPr>
+                <w:sz w:val="22"/>
+              </w:rPr>
+              <w:t>RNF-05</w:t>
+            </w:r>
+          </w:p>
+        </w:tc>
+        <w:tc>
+          <w:tcPr>
+            <w:tcW w:type="dxa" w:w="2160"/>
+          </w:tcPr>
+          <w:p>
+            <w:r>
+              <w:rPr>
+                <w:sz w:val="22"/>
+              </w:rPr>
+              <w:t>Compatibilidad entre navegadores (Chrome/Firefox/Edge)</w:t>
+            </w:r>
+          </w:p>
+        </w:tc>
+        <w:tc>
+          <w:tcPr>
+            <w:tcW w:type="dxa" w:w="2160"/>
+          </w:tcPr>
+          <w:p>
+            <w:pPr>
+              <w:jc w:val="center"/>
+            </w:pPr>
+            <w:r>
+              <w:rPr>
+                <w:sz w:val="22"/>
+              </w:rPr>
+              <w:t>Parcial (validación manual pendiente)</w:t>
+            </w:r>
+          </w:p>
+        </w:tc>
+        <w:tc>
+          <w:tcPr>
+            <w:tcW w:type="dxa" w:w="2160"/>
+          </w:tcPr>
+          <w:p>
+            <w:pPr>
+              <w:jc w:val="center"/>
+            </w:pPr>
+            <w:r>
+              <w:rPr>
+                <w:sz w:val="22"/>
+              </w:rPr>
+              <w:t>2-4</w:t>
+            </w:r>
+          </w:p>
+        </w:tc>
+      </w:tr>
+      <w:tr>
+        <w:tc>
+          <w:tcPr>
+            <w:tcW w:type="dxa" w:w="2160"/>
+          </w:tcPr>
+          <w:p>
+            <w:r>
+              <w:rPr>
+                <w:sz w:val="22"/>
+              </w:rPr>
+              <w:t>RNF-RESP</w:t>
+            </w:r>
+          </w:p>
+        </w:tc>
+        <w:tc>
+          <w:tcPr>
+            <w:tcW w:type="dxa" w:w="2160"/>
+          </w:tcPr>
+          <w:p>
+            <w:r>
+              <w:rPr>
+                <w:sz w:val="22"/>
+              </w:rPr>
+              <w:t>Diseño responsivo para vistas de frontend</w:t>
+            </w:r>
+          </w:p>
+        </w:tc>
+        <w:tc>
+          <w:tcPr>
+            <w:tcW w:type="dxa" w:w="2160"/>
+          </w:tcPr>
+          <w:p>
+            <w:pPr>
+              <w:jc w:val="center"/>
+            </w:pPr>
+            <w:r>
+              <w:rPr>
+                <w:sz w:val="22"/>
+              </w:rPr>
+              <w:t>Parcial (embebido en RF)</w:t>
+            </w:r>
+          </w:p>
+        </w:tc>
+        <w:tc>
+          <w:tcPr>
+            <w:tcW w:type="dxa" w:w="2160"/>
+          </w:tcPr>
+          <w:p>
+            <w:pPr>
+              <w:jc w:val="center"/>
+            </w:pPr>
+            <w:r>
+              <w:rPr>
+                <w:sz w:val="22"/>
+              </w:rPr>
+              <w:t>2-3</w:t>
+            </w:r>
+          </w:p>
+        </w:tc>
+      </w:tr>
+      <w:tr>
+        <w:tc>
+          <w:tcPr>
+            <w:tcW w:type="dxa" w:w="2160"/>
+          </w:tcPr>
+          <w:p>
+            <w:r>
+              <w:rPr>
+                <w:sz w:val="22"/>
+              </w:rPr>
+              <w:t>RNF-SEC</w:t>
+            </w:r>
+          </w:p>
+        </w:tc>
+        <w:tc>
+          <w:tcPr>
+            <w:tcW w:type="dxa" w:w="2160"/>
+          </w:tcPr>
+          <w:p>
+            <w:r>
+              <w:rPr>
+                <w:sz w:val="22"/>
+              </w:rPr>
+              <w:t>Protección de login con rate limiting por intentos fallidos</w:t>
+            </w:r>
+          </w:p>
+        </w:tc>
+        <w:tc>
+          <w:tcPr>
+            <w:tcW w:type="dxa" w:w="2160"/>
+          </w:tcPr>
+          <w:p>
+            <w:pPr>
+              <w:jc w:val="center"/>
+            </w:pPr>
+            <w:r>
+              <w:rPr>
+                <w:sz w:val="22"/>
+              </w:rPr>
+              <w:t>Yes</w:t>
+            </w:r>
+          </w:p>
+        </w:tc>
+        <w:tc>
+          <w:tcPr>
+            <w:tcW w:type="dxa" w:w="2160"/>
+          </w:tcPr>
+          <w:p>
+            <w:pPr>
+              <w:jc w:val="center"/>
+            </w:pPr>
+            <w:r>
+              <w:rPr>
+                <w:sz w:val="22"/>
+              </w:rPr>
+              <w:t>3</w:t>
             </w:r>
           </w:p>
         </w:tc>

</xml_diff>